<commit_message>
single user account concurrency
</commit_message>
<xml_diff>
--- a/CLIENT_SETUP_AI_LABS_SAMPLES.docx
+++ b/CLIENT_SETUP_AI_LABS_SAMPLES.docx
@@ -2335,16 +2335,7 @@
           </w:tcPr>
           <w:p>
             <w:r>
-              <w:t xml:space="preserve">Workspace mode only. 0 (default): thorough global mode — scan everyone, then select fairly across all accounts, then transfer. A number &gt; 0: fast streaming mode — scan/select/transfer </w:t>
-            </w:r>
-            <w:r>
-              <w:rPr>
-                <w:b/>
-              </w:rPr>
-              <w:t>one account at a time</w:t>
-            </w:r>
-            <w:r>
-              <w:t>, in batches of N folders, flat equal cap share per account, no cross-account fairness — see below.</w:t>
+              <w:t>0 (default): thorough global mode — scan everything, then select fairly, then transfer. A number &gt; 0: fast streaming mode — scan/select/transfer in batches of N folders with scanning and transferring happening concurrently, no cross-account fairness — see below. Works in both Workspace mode (batches = accounts) and single-account "My Drive + Gmail only" mode (batches = rounds of N folders within the one account).</w:t>
             </w:r>
           </w:p>
         </w:tc>
@@ -2583,7 +2574,16 @@
         <w:t>concurrently</w:t>
       </w:r>
       <w:r>
-        <w:t xml:space="preserve"> with scanning instead of after it — as soon as one account finishes being scanned and selected, its files are handed to a background transfer worker while the script immediately moves on to scanning the *next* account. See </w:t>
+        <w:t xml:space="preserve"> with scanning instead of after it. In Workspace mode, as soon as one account finishes being scanned and selected, its files are handed to a background transfer worker while the script immediately moves on to scanning the *next* account. In single-account "My Drive + Gmail only" mode there's only one account to scan, so the same idea applies </w:t>
+      </w:r>
+      <w:r>
+        <w:rPr>
+          <w:b/>
+        </w:rPr>
+        <w:t>within</w:t>
+      </w:r>
+      <w:r>
+        <w:t xml:space="preserve"> it: as soon as one round of N folders is scanned and selected, those files are handed to a background transfer worker while the script immediately moves on to scanning the *next round* of that account's remaining folders — Gmail, in single-account mode, is still collected and transferred as one pass after Drive finishes, not round-streamed. See </w:t>
       </w:r>
       <w:r>
         <w:rPr>
@@ -2614,21 +2614,12 @@
         <w:pStyle w:val="Heading2"/>
       </w:pPr>
       <w:r>
-        <w:t>Speeding up huge Workspaces with --folders-per-round</w:t>
+        <w:t>Speeding up huge Workspaces (or one huge Drive) with --folders-per-round</w:t>
       </w:r>
     </w:p>
     <w:p>
       <w:r>
-        <w:t xml:space="preserve">For an org with hundreds of users each holding tens of thousands of files, waiting for the *entire* Workspace to be scanned and fairly ranked before a single file transfers can simply take too long. Setting --folders-per-round (Workspace mode only) switches to a genuinely faster, streaming pipeline — </w:t>
-      </w:r>
-      <w:r>
-        <w:rPr>
-          <w:b/>
-        </w:rPr>
-        <w:t>account by account</w:t>
-      </w:r>
-      <w:r>
-        <w:t xml:space="preserve">, with scanning and transferring happening </w:t>
+        <w:t xml:space="preserve">For an org with hundreds of users each holding tens of thousands of files, waiting for the *entire* Workspace to be scanned and fairly ranked before a single file transfers can simply take too long. Setting --folders-per-round switches to a genuinely faster, streaming pipeline, with scanning and transferring happening </w:t>
       </w:r>
       <w:r>
         <w:rPr>
@@ -2637,7 +2628,15 @@
         <w:t>concurrently</w:t>
       </w:r>
       <w:r>
-        <w:t>, not one after the other:</w:t>
+        <w:t>, not one after the other. It works in both modes, at two different granularities:</w:t>
+      </w:r>
+    </w:p>
+    <w:p>
+      <w:r>
+        <w:rPr>
+          <w:b/>
+        </w:rPr>
+        <w:t>Workspace mode — account by account:</w:t>
       </w:r>
     </w:p>
     <w:p>
@@ -2710,10 +2709,74 @@
         <w:rPr>
           <w:b/>
         </w:rPr>
+        <w:t>Single-account ("My Drive + Gmail only") mode — round by round:</w:t>
+      </w:r>
+    </w:p>
+    <w:p>
+      <w:r>
+        <w:t xml:space="preserve">There's only one account, so there's no "next account" to overlap with — instead the same idea applies to successive </w:t>
+      </w:r>
+      <w:r>
+        <w:rPr>
+          <w:b/>
+        </w:rPr>
+        <w:t>rounds</w:t>
+      </w:r>
+      <w:r>
+        <w:t xml:space="preserve"> of that one account's own Drive:</w:t>
+      </w:r>
+    </w:p>
+    <w:p>
+      <w:pPr>
+        <w:pStyle w:val="ListBullet"/>
+      </w:pPr>
+      <w:r>
+        <w:t xml:space="preserve">Drive is scanned in batches of N folders (a "round"). Each round's newly-found files are selected against </w:t>
+      </w:r>
+      <w:r>
+        <w:rPr>
+          <w:b/>
+        </w:rPr>
+        <w:t>one shared running budget across rounds</w:t>
+      </w:r>
+      <w:r>
+        <w:t xml:space="preserve"> — the same --drive-cap-gb, decremented round by round. The moment that budget hits zero, scanning stops immediately, even if the account's Drive isn't fully walked yet.</w:t>
+      </w:r>
+    </w:p>
+    <w:p>
+      <w:pPr>
+        <w:pStyle w:val="ListBullet"/>
+      </w:pPr>
+      <w:r>
+        <w:t xml:space="preserve">Unless --scan-only was passed, </w:t>
+      </w:r>
+      <w:r>
+        <w:rPr>
+          <w:b/>
+        </w:rPr>
+        <w:t>hand that round's selected files to a background transfer worker and immediately move on to scanning the next round</w:t>
+      </w:r>
+      <w:r>
+        <w:t xml:space="preserve"> of the same account's remaining folders — scanning round N+1 and transferring round N's files happen at the same time, not sequentially.</w:t>
+      </w:r>
+    </w:p>
+    <w:p>
+      <w:pPr>
+        <w:pStyle w:val="ListBullet"/>
+      </w:pPr>
+      <w:r>
+        <w:t>Gmail is unaffected by this — it's still collected and transferred as a single pass after Drive finishes (there's no equivalent "rounds" concept for a single mailbox).</w:t>
+      </w:r>
+    </w:p>
+    <w:p>
+      <w:r>
+        <w:rPr>
+          <w:b/>
+        </w:rPr>
         <w:t>This is a real trade-off, not just a scanning shortcut</w:t>
       </w:r>
       <w:r>
-        <w:t>: the priority-by-data-volume and cross-account top-up behavior described earlier in this section only applies when --folders-per-round 0 (the default). With it set, whichever accounts get scanned first can consume the entire Drive budget, later accounts can end up with zero Drive files purely because of scan order, and there's no cross-account top-up for native files — simpler and much faster, at the cost of that fairness/optimality. Use 0 when you want the thorough, globally-fair manifest (e.g. building one to hand off via --scan-only for someone else to review); use a real batch size when you need results fast and can live with scan-order deciding who gets included.</w:t>
+        <w:t>: the priority-by-data-volume and cross-account top-up behavior (Workspace mode) or the size/recency-optimal single-pass selection (single-account mode) described earlier in this section only applies when --folders-per-round 0 (the default). With it set, whichever accounts/rounds get scanned first can consume the entire Drive budget, later accounts/folders can end up excluded purely because of scan order, and there's no cross-account top-up for native files — simpler and much faster, at the cost of that fairness/optimality. Use 0 when you want the thorough, globally-optimal manifest (e.g. building one to hand off via --scan-only for someone else to review); use a real batch size when you need results fast and can live with scan-order deciding what gets included.</w:t>
       </w:r>
     </w:p>
     <w:p>

</xml_diff>

<commit_message>
single user account concurrency gmail
</commit_message>
<xml_diff>
--- a/CLIENT_SETUP_AI_LABS_SAMPLES.docx
+++ b/CLIENT_SETUP_AI_LABS_SAMPLES.docx
@@ -2335,7 +2335,48 @@
           </w:tcPr>
           <w:p>
             <w:r>
-              <w:t>0 (default): thorough global mode — scan everything, then select fairly, then transfer. A number &gt; 0: fast streaming mode — scan/select/transfer in batches of N folders with scanning and transferring happening concurrently, no cross-account fairness — see below. Works in both Workspace mode (batches = accounts) and single-account "My Drive + Gmail only" mode (batches = rounds of N folders within the one account).</w:t>
+              <w:t>0 (default): thorough global mode — scan everything, then select fairly, then transfer. A number &gt; 0: fast streaming mode — scan/select/transfer in batches of N folders (Drive) with scanning and transferring happening concurrently, no cross-account fairness — see below. Works in both Workspace mode (batches = accounts) and single-account "My Drive + Gmail only" mode (batches = rounds of N folders within the one account). Also turns on Gmail round-streaming (see --messages-per-round).</w:t>
+            </w:r>
+          </w:p>
+        </w:tc>
+      </w:tr>
+      <w:tr>
+        <w:tc>
+          <w:tcPr>
+            <w:tcW w:type="dxa" w:w="2880"/>
+          </w:tcPr>
+          <w:p>
+            <w:r>
+              <w:t>--messages-per-round</w:t>
+            </w:r>
+          </w:p>
+        </w:tc>
+        <w:tc>
+          <w:tcPr>
+            <w:tcW w:type="dxa" w:w="2880"/>
+          </w:tcPr>
+          <w:p>
+            <w:r>
+              <w:t>2000</w:t>
+            </w:r>
+          </w:p>
+        </w:tc>
+        <w:tc>
+          <w:tcPr>
+            <w:tcW w:type="dxa" w:w="2880"/>
+          </w:tcPr>
+          <w:p>
+            <w:r>
+              <w:t xml:space="preserve">Gmail's equivalent of --folders-per-round: batch size in messages. Only takes effect when --folders-per-round &gt; 0. See </w:t>
+            </w:r>
+            <w:r>
+              <w:rPr>
+                <w:b/>
+              </w:rPr>
+              <w:t>Speeding up huge Workspaces</w:t>
+            </w:r>
+            <w:r>
+              <w:t xml:space="preserve"> below.</w:t>
             </w:r>
           </w:p>
         </w:tc>
@@ -2574,7 +2615,7 @@
         <w:t>concurrently</w:t>
       </w:r>
       <w:r>
-        <w:t xml:space="preserve"> with scanning instead of after it. In Workspace mode, as soon as one account finishes being scanned and selected, its files are handed to a background transfer worker while the script immediately moves on to scanning the *next* account. In single-account "My Drive + Gmail only" mode there's only one account to scan, so the same idea applies </w:t>
+        <w:t xml:space="preserve"> with scanning instead of after it — for both Drive and Gmail. In Workspace mode, as soon as one account finishes being scanned and selected, its files/threads are handed to a background transfer worker while the script immediately moves on to scanning the *next* account. In single-account "My Drive + Gmail only" mode there's only one account to scan, so the same idea applies </w:t>
       </w:r>
       <w:r>
         <w:rPr>
@@ -2583,7 +2624,7 @@
         <w:t>within</w:t>
       </w:r>
       <w:r>
-        <w:t xml:space="preserve"> it: as soon as one round of N folders is scanned and selected, those files are handed to a background transfer worker while the script immediately moves on to scanning the *next round* of that account's remaining folders — Gmail, in single-account mode, is still collected and transferred as one pass after Drive finishes, not round-streamed. See </w:t>
+        <w:t xml:space="preserve"> it: as soon as one round (of N folders for Drive, or N messages for Gmail — see --messages-per-round) is scanned and selected, that round is handed to a background transfer worker while the script immediately moves on to scanning the *next round* of that same account's remaining folders/mailbox. See </w:t>
       </w:r>
       <w:r>
         <w:rPr>
@@ -2636,7 +2677,7 @@
         <w:rPr>
           <w:b/>
         </w:rPr>
-        <w:t>Workspace mode — account by account:</w:t>
+        <w:t>Workspace mode — account by account (Drive), and round by round within each account (Gmail):</w:t>
       </w:r>
     </w:p>
     <w:p>
@@ -2705,11 +2746,25 @@
       </w:r>
     </w:p>
     <w:p>
+      <w:pPr>
+        <w:pStyle w:val="ListBullet"/>
+      </w:pPr>
       <w:r>
         <w:rPr>
           <w:b/>
         </w:rPr>
-        <w:t>Single-account ("My Drive + Gmail only") mode — round by round:</w:t>
+        <w:t>Within each account's own Gmail share</w:t>
+      </w:r>
+      <w:r>
+        <w:t>, messages are scanned in batches of --messages-per-round (default 2000) — the same round pattern as Drive, just one level down: each batch is selected and handed to the background transfer worker while scanning continues into that *same account's* next batch of messages, not just overlapping with other accounts.</w:t>
+      </w:r>
+    </w:p>
+    <w:p>
+      <w:r>
+        <w:rPr>
+          <w:b/>
+        </w:rPr>
+        <w:t>Single-account ("My Drive + Gmail only") mode — round by round, for both Drive and Gmail:</w:t>
       </w:r>
     </w:p>
     <w:p>
@@ -2723,7 +2778,7 @@
         <w:t>rounds</w:t>
       </w:r>
       <w:r>
-        <w:t xml:space="preserve"> of that one account's own Drive:</w:t>
+        <w:t xml:space="preserve"> within that one account, for Drive and Gmail independently:</w:t>
       </w:r>
     </w:p>
     <w:p>
@@ -2765,7 +2820,18 @@
         <w:pStyle w:val="ListBullet"/>
       </w:pPr>
       <w:r>
-        <w:t>Gmail is unaffected by this — it's still collected and transferred as a single pass after Drive finishes (there's no equivalent "rounds" concept for a single mailbox).</w:t>
+        <w:t>Gmail works the same way, batched by --messages-per-round messages instead of folders: each batch of messages is scanned, the resulting threads selected against the running --gmail-cap-gb budget, and handed off for background transfer while scanning continues into the next batch.</w:t>
+      </w:r>
+    </w:p>
+    <w:p>
+      <w:r>
+        <w:rPr>
+          <w:b/>
+        </w:rPr>
+        <w:t>Gmail's cap is approximate under round-streaming, unlike Drive's.</w:t>
+      </w:r>
+      <w:r>
+        <w:t xml:space="preserve"> A Drive file's size is known the instant it's seen, so Drive's cap accounting is always exact. A Gmail thread is different: message IDs aren't returned grouped by thread, so a long-running thread's messages can be scattered across many rounds — by the time a thread looks "done" and gets selected, later rounds can still turn up more of its messages. The transfer itself is unaffected (it always pulls the *complete* thread, so nothing is ever missed on disk), but the byte total charged against --gmail-cap-gb at selection time only reflects what had been seen so far — so actual bytes transferred for that thread can run a bit over what was budgeted, bounded by that one thread's own size. In practice this means the Gmail portion can modestly overshoot --gmail-cap-gb under round-streaming; it's exact only when --folders-per-round 0 (the default, whole-mailbox-first mode).</w:t>
       </w:r>
     </w:p>
     <w:p>
@@ -2776,7 +2842,7 @@
         <w:t>This is a real trade-off, not just a scanning shortcut</w:t>
       </w:r>
       <w:r>
-        <w:t>: the priority-by-data-volume and cross-account top-up behavior (Workspace mode) or the size/recency-optimal single-pass selection (single-account mode) described earlier in this section only applies when --folders-per-round 0 (the default). With it set, whichever accounts/rounds get scanned first can consume the entire Drive budget, later accounts/folders can end up excluded purely because of scan order, and there's no cross-account top-up for native files — simpler and much faster, at the cost of that fairness/optimality. Use 0 when you want the thorough, globally-optimal manifest (e.g. building one to hand off via --scan-only for someone else to review); use a real batch size when you need results fast and can live with scan-order deciding what gets included.</w:t>
+        <w:t>: the priority-by-data-volume and cross-account top-up behavior (Workspace mode) or the size/recency-optimal single-pass selection (single-account mode) described earlier in this section, and Gmail's exact cap enforcement, only apply when --folders-per-round 0 (the default). With it set, whichever accounts/rounds get scanned first can consume the entire Drive budget, later accounts/folders can end up excluded purely because of scan order, there's no cross-account top-up for native files, and Gmail's cap can be modestly overshot as described above — simpler and much faster, at the cost of that fairness/optimality/precision. Use 0 when you want the thorough, globally-optimal, cap-exact manifest (e.g. building one to hand off via --scan-only for someone else to review); use a real batch size when you need results fast and can live with those trade-offs.</w:t>
       </w:r>
     </w:p>
     <w:p>

</xml_diff>

<commit_message>
Fix setup docs to clone inventory-samples, not inventory-segmentor.
Co-authored-by: Cursor <cursoragent@cursor.com>
</commit_message>
<xml_diff>
--- a/CLIENT_SETUP_AI_LABS_SAMPLES.docx
+++ b/CLIENT_SETUP_AI_LABS_SAMPLES.docx
@@ -70,14 +70,14 @@
         <w:br/>
         <w:t>```</w:t>
         <w:br/>
-        <w:t>git clone https://github.com/data927/inventory-segmentor.git</w:t>
+        <w:t>git clone https://github.com/data927/inventory-samples.git</w:t>
         <w:br/>
         <w:t>```</w:t>
         <w:br/>
         <w:br/>
         <w:t>```</w:t>
         <w:br/>
-        <w:t>cd inventory-segmentor</w:t>
+        <w:t>cd inventory-samples</w:t>
         <w:br/>
         <w:t>```</w:t>
         <w:br/>
@@ -693,7 +693,7 @@
         <w:br/>
         <w:t>```</w:t>
         <w:br/>
-        <w:t>cd ~/inventory-segmentor</w:t>
+        <w:t>cd ~/inventory-samples</w:t>
         <w:br/>
         <w:t>source .venv/bin/activate</w:t>
         <w:br/>
@@ -704,7 +704,7 @@
         <w:br/>
         <w:t>```</w:t>
         <w:br/>
-        <w:t>cd %USERPROFILE%\inventory-segmentor</w:t>
+        <w:t>cd %USERPROFILE%\inventory-samples</w:t>
         <w:br/>
         <w:t>.venv\Scripts\activate</w:t>
         <w:br/>

</xml_diff>

<commit_message>
Use Domain-Wide Delegation for full-account and as-is transfers.
Sample folder is created in the super-admin My Drive; the selected user copies via DWD with no personal OAuth.

Co-authored-by: Cursor <cursoragent@cursor.com>
</commit_message>
<xml_diff>
--- a/CLIENT_SETUP_AI_LABS_SAMPLES.docx
+++ b/CLIENT_SETUP_AI_LABS_SAMPLES.docx
@@ -447,7 +447,7 @@
         <w:br/>
         <w:t>```</w:t>
         <w:br/>
-        <w:t>https://www.googleapis.com/auth/drive.readonly,https://www.googleapis.com/auth/admin.directory.user.readonly,https://www.googleapis.com/auth/gmail.readonly</w:t>
+        <w:t>https://www.googleapis.com/auth/drive,https://www.googleapis.com/auth/admin.directory.user.readonly,https://www.googleapis.com/auth/gmail.readonly</w:t>
         <w:br/>
         <w:t>```</w:t>
         <w:br/>
@@ -455,6 +455,9 @@
         <w:t>→ **Authorise**. Wait 5–10 min if first run fails with `unauthorized_client`.</w:t>
         <w:br/>
         <w:br/>
+        <w:t>Use the full `drive` scope (not only `drive.readonly`) so `--full-account` / `--as-is` can create the sample folder in the **super-admin** My Drive and copy via Domain-Wide Delegation with **no personal OAuth browser login**.</w:t>
+        <w:br/>
+        <w:br/>
         <w:t>**Operator — save credentials**</w:t>
         <w:br/>
         <w:br/>
@@ -485,7 +488,7 @@
         <w:t>**Run — one account, entire My Drive (transfer only, no quality scan)**</w:t>
         <w:br/>
         <w:br/>
-        <w:t>Creates `AI Labs Sample Set (date)` and starts copying **as soon as the script begins** (walk and transfer overlap). Copies **everything** from that user's My Drive. No 15GB/12.5GB caps, no Gmail.</w:t>
+        <w:t>Uses **Domain-Wide Delegation only** (service account + super-admin). Creates `AI Labs Sample Set (date)` in the **admin** My Drive and starts copying immediately. No personal OAuth login, no Gmail.</w:t>
         <w:br/>
         <w:br/>
         <w:t>```</w:t>
@@ -506,22 +509,7 @@
         <w:t>**Run — one account, as-is until 10GB (no quality scan)**</w:t>
         <w:br/>
         <w:br/>
-        <w:t>Walk order as-is, transfer starts immediately, stops once **10GB** is fulfilled. No Gmail.</w:t>
-        <w:br/>
-        <w:br/>
-        <w:t>```</w:t>
-        <w:br/>
-        <w:t>python tools/build_quality_sample.py \</w:t>
-        <w:br/>
-        <w:t xml:space="preserve">  --service-account ~/Downloads/service_account.json \</w:t>
-        <w:br/>
-        <w:t xml:space="preserve">  --admin-email admin@yourdomain.com \</w:t>
-        <w:br/>
-        <w:t xml:space="preserve">  --users alice@yourdomain.com \</w:t>
-        <w:br/>
-        <w:t xml:space="preserve">  --as-is</w:t>
-        <w:br/>
-        <w:t>```</w:t>
+        <w:t>Same DWD path; walk order as-is; stops at **10GB**. Folder lands in the **admin** My Drive.</w:t>
         <w:br/>
         <w:br/>
         <w:t>```</w:t>

</xml_diff>

<commit_message>
Default as-is cap to 40GB and ensure selected user has folder access.
Share the admin sample folder (and best-effort child) with the selected user as writer.

Co-authored-by: Cursor <cursoragent@cursor.com>
</commit_message>
<xml_diff>
--- a/CLIENT_SETUP_AI_LABS_SAMPLES.docx
+++ b/CLIENT_SETUP_AI_LABS_SAMPLES.docx
@@ -172,7 +172,7 @@
         <w:t>```</w:t>
         <w:br/>
         <w:br/>
-        <w:t>Skips Parts 3–8. **`--entire`**: one account's full data. **`--as-is`**: walk order until **10GB**. **Default multi-folder**: first **1000 files** each, then fill to **15GB**. Copies onto the **Desktop**.</w:t>
+        <w:t>Skips Parts 3–8. **`--entire`**: one account's full data. **`--as-is`**: walk order until **40GB**. **Default multi-folder**: first **1000 files** each, then fill to **15GB**. Copies onto the **Desktop**.</w:t>
         <w:br/>
         <w:br/>
         <w:t>Full local-only guide: `CLIENT_SETUP_AI_LABS_SAMPLES_LOCAL.docx`</w:t>
@@ -188,12 +188,12 @@
         <w:t>```</w:t>
         <w:br/>
         <w:br/>
-        <w:t>**Run — as-is until 10GB**</w:t>
+        <w:t>**Run — as-is until 40GB**</w:t>
         <w:br/>
         <w:br/>
         <w:t>```</w:t>
         <w:br/>
-        <w:t>python tools/build_quality_sample_local.py --root ~/Downloads/company-dump --as-is --cap-gb 10</w:t>
+        <w:t>python tools/build_quality_sample_local.py --root ~/Downloads/company-dump --as-is --cap-gb 40</w:t>
         <w:br/>
         <w:t>```</w:t>
         <w:br/>
@@ -399,10 +399,10 @@
         <w:t>```</w:t>
         <w:br/>
         <w:br/>
-        <w:t>**As-is until 10GB (no quality scan):**</w:t>
-        <w:br/>
-        <w:br/>
-        <w:t>Same immediate transfer, walk order as-is, stops when **10GB** of file data is queued. No Gmail.</w:t>
+        <w:t>**As-is until 40GB (no quality scan):**</w:t>
+        <w:br/>
+        <w:br/>
+        <w:t>Same immediate transfer, walk order as-is, stops when **40GB** of file data is queued. Folder is shared with the selected user (writer). No Gmail.</w:t>
         <w:br/>
         <w:br/>
         <w:t>```</w:t>
@@ -417,7 +417,7 @@
         <w:br/>
         <w:t>```</w:t>
         <w:br/>
-        <w:t>python tools/build_quality_sample.py --as-is --cap-gb 10</w:t>
+        <w:t>python tools/build_quality_sample.py --as-is --cap-gb 40</w:t>
         <w:br/>
         <w:t>```</w:t>
         <w:br/>
@@ -506,10 +506,10 @@
         <w:t>```</w:t>
         <w:br/>
         <w:br/>
-        <w:t>**Run — one account, as-is until 10GB (no quality scan)**</w:t>
-        <w:br/>
-        <w:br/>
-        <w:t>Same DWD path; walk order as-is; stops at **10GB**. Folder lands in the **admin** My Drive.</w:t>
+        <w:t>**Run — one account, as-is until 40GB (no quality scan)**</w:t>
+        <w:br/>
+        <w:br/>
+        <w:t>Same DWD path; walk order as-is; stops at **40GB**. Folder lands in the **admin** My Drive and is **shared with the selected user** so they can open it too.</w:t>
         <w:br/>
         <w:br/>
         <w:t>```</w:t>
@@ -522,7 +522,7 @@
         <w:br/>
         <w:t xml:space="preserve">  --users alice@yourdomain.com \</w:t>
         <w:br/>
-        <w:t xml:space="preserve">  --as-is --cap-gb 10</w:t>
+        <w:t xml:space="preserve">  --as-is --cap-gb 40</w:t>
         <w:br/>
         <w:t>```</w:t>
         <w:br/>
@@ -622,7 +622,7 @@
         <w:br/>
         <w:t>| `--full-account` | off | Entire My Drive of one account → AI Labs Sample Set (no quality scan/caps/Gmail) |</w:t>
         <w:br/>
-        <w:t>| `--as-is` | off | Walk-order Drive copy until `--cap-gb` (default 10GB); no quality scan/Gmail |</w:t>
+        <w:t>| `--as-is` | off | Walk-order Drive copy until `--cap-gb` (default 40GB); no quality scan/Gmail |</w:t>
         <w:br/>
         <w:t>| `--cap-gb` | `10` with `--as-is` | Byte cap (GB) for `--as-is` / optional trim for `--full-account` |</w:t>
         <w:br/>
@@ -934,7 +934,7 @@
         <w:t xml:space="preserve">  --full-account</w:t>
         <w:br/>
         <w:br/>
-        <w:t># As-is until 10GB (walk order, transfer starts immediately)</w:t>
+        <w:t># As-is until 40GB (walk order, transfer starts immediately)</w:t>
         <w:br/>
         <w:t>python tools/build_quality_sample.py --as-is</w:t>
         <w:br/>
@@ -946,7 +946,7 @@
         <w:br/>
         <w:t xml:space="preserve">  --users alice@yourdomain.com \</w:t>
         <w:br/>
-        <w:t xml:space="preserve">  --as-is --cap-gb 10</w:t>
+        <w:t xml:space="preserve">  --as-is --cap-gb 40</w:t>
         <w:br/>
         <w:br/>
         <w:t># My Drive only (capped quality sample)</w:t>

</xml_diff>

<commit_message>
Make --full-account Drive 5GB as-is plus full Gmail scan/transfer.
Co-authored-by: Cursor <cursoragent@cursor.com>
</commit_message>
<xml_diff>
--- a/CLIENT_SETUP_AI_LABS_SAMPLES.docx
+++ b/CLIENT_SETUP_AI_LABS_SAMPLES.docx
@@ -386,10 +386,10 @@
         <w:t>```</w:t>
         <w:br/>
         <w:br/>
-        <w:t>**Entire account — Drive only (no quality scan, no caps, no Gmail):**</w:t>
-        <w:br/>
-        <w:br/>
-        <w:t>Creates `AI Labs Sample Set (date)` in your My Drive and starts copying **immediately** — first folders are listed, then transfer runs in the background while the rest of the Drive is walked. Copies **every** file from the signed-in account.</w:t>
+        <w:t>**Entire account / full-account sample (Drive 5GB + Gmail):**</w:t>
+        <w:br/>
+        <w:br/>
+        <w:t>Creates `AI Labs Sample Set (date)` in admin My Drive (DWD), shares with the selected user, copies Drive as-is until **5GB**, then scans + transfers that user's **full Gmail**.</w:t>
         <w:br/>
         <w:br/>
         <w:t>```</w:t>
@@ -399,6 +399,24 @@
         <w:t>```</w:t>
         <w:br/>
         <w:br/>
+        <w:t>Workspace:</w:t>
+        <w:br/>
+        <w:br/>
+        <w:t>```</w:t>
+        <w:br/>
+        <w:t>python tools/build_quality_sample.py \</w:t>
+        <w:br/>
+        <w:t xml:space="preserve">  --service-account ~/Downloads/service_account.json \</w:t>
+        <w:br/>
+        <w:t xml:space="preserve">  --admin-email admin@yourdomain.com \</w:t>
+        <w:br/>
+        <w:t xml:space="preserve">  --users alice@yourdomain.com \</w:t>
+        <w:br/>
+        <w:t xml:space="preserve">  --full-account</w:t>
+        <w:br/>
+        <w:t>```</w:t>
+        <w:br/>
+        <w:br/>
         <w:t>**As-is until 40GB (no quality scan):**</w:t>
         <w:br/>
         <w:br/>
@@ -485,10 +503,10 @@
         <w:t>```</w:t>
         <w:br/>
         <w:br/>
-        <w:t>**Run — one account, entire My Drive (transfer only, no quality scan)**</w:t>
-        <w:br/>
-        <w:br/>
-        <w:t>Uses **Domain-Wide Delegation only** (service account + super-admin). Creates `AI Labs Sample Set (date)` in the **admin** My Drive and starts copying immediately. No personal OAuth login, no Gmail.</w:t>
+        <w:t>**Run — one account, Drive 5GB + full Gmail (no quality scan)**</w:t>
+        <w:br/>
+        <w:br/>
+        <w:t>Uses **Domain-Wide Delegation**. Creates `AI Labs Sample Set (date)` in the **admin** My Drive (shared with the selected user), copies Drive **as-is until 5GB**, then scans + transfers that user's **entire Gmail**.</w:t>
         <w:br/>
         <w:br/>
         <w:t>```</w:t>
@@ -620,11 +638,11 @@
         <w:br/>
         <w:t>| --- | --- | --- |</w:t>
         <w:br/>
-        <w:t>| `--full-account` | off | Entire My Drive of one account → AI Labs Sample Set (no quality scan/caps/Gmail) |</w:t>
+        <w:t>| `--full-account` | off | One account: Drive as-is to **5GB** + full Gmail scan/transfer (DWD) |</w:t>
         <w:br/>
         <w:t>| `--as-is` | off | Walk-order Drive copy until `--cap-gb` (default 40GB); no quality scan/Gmail |</w:t>
         <w:br/>
-        <w:t>| `--cap-gb` | `10` with `--as-is` | Byte cap (GB) for `--as-is` / optional trim for `--full-account` |</w:t>
+        <w:t>| `--cap-gb` | `5` / `40` | Drive byte cap (GB): default 5 with `--full-account`, 40 with `--as-is` |</w:t>
         <w:br/>
         <w:t>| `--drive-cap-gb` | `15` | Drive binary cap (GB) |</w:t>
         <w:br/>
@@ -919,7 +937,7 @@
         <w:t>python tools/build_quality_sample_local.py --root ~/Downloads/company-dump</w:t>
         <w:br/>
         <w:br/>
-        <w:t># One account — entire My Drive → AI Labs Sample Set (no quality scan)</w:t>
+        <w:t># One account — Drive 5GB + full Gmail</w:t>
         <w:br/>
         <w:t>python tools/build_quality_sample.py --full-account</w:t>
         <w:br/>

</xml_diff>

<commit_message>
Limit --full-account Gmail to first 100 messages, 20 threads, 3GB.
Co-authored-by: Cursor <cursoragent@cursor.com>
</commit_message>
<xml_diff>
--- a/CLIENT_SETUP_AI_LABS_SAMPLES.docx
+++ b/CLIENT_SETUP_AI_LABS_SAMPLES.docx
@@ -386,10 +386,10 @@
         <w:t>```</w:t>
         <w:br/>
         <w:br/>
-        <w:t>**Entire account / full-account sample (Drive 5GB + Gmail):**</w:t>
-        <w:br/>
-        <w:br/>
-        <w:t>Creates `AI Labs Sample Set (date)` in admin My Drive (DWD), shares with the selected user, copies Drive as-is until **5GB**, then scans + transfers that user's **full Gmail**.</w:t>
+        <w:t>**Entire account / full-account sample (Drive 5GB + Gmail sample):**</w:t>
+        <w:br/>
+        <w:br/>
+        <w:t>Creates `AI Labs Sample Set (date)` in admin My Drive (DWD), shares with the selected user, copies Drive as-is until **5GB**, then Gmail: first **100** messages → up to **20** threads (discovery order), **3GB** cap.</w:t>
         <w:br/>
         <w:br/>
         <w:t>```</w:t>
@@ -503,10 +503,10 @@
         <w:t>```</w:t>
         <w:br/>
         <w:br/>
-        <w:t>**Run — one account, Drive 5GB + full Gmail (no quality scan)**</w:t>
-        <w:br/>
-        <w:br/>
-        <w:t>Uses **Domain-Wide Delegation**. Creates `AI Labs Sample Set (date)` in the **admin** My Drive (shared with the selected user), copies Drive **as-is until 5GB**, then scans + transfers that user's **entire Gmail**.</w:t>
+        <w:t>**Run — one account, Drive 5GB + Gmail sample (no quality scan)**</w:t>
+        <w:br/>
+        <w:br/>
+        <w:t>Uses **Domain-Wide Delegation**. Creates `AI Labs Sample Set (date)` in the **admin** My Drive (shared with the selected user), copies Drive **as-is until 5GB**, then Gmail sample: first **100** messages → up to **20** threads, **3GB** cap.</w:t>
         <w:br/>
         <w:br/>
         <w:t>```</w:t>
@@ -638,7 +638,7 @@
         <w:br/>
         <w:t>| --- | --- | --- |</w:t>
         <w:br/>
-        <w:t>| `--full-account` | off | One account: Drive as-is to **5GB** + full Gmail scan/transfer (DWD) |</w:t>
+        <w:t>| `--full-account` | off | One account: Drive as-is to **5GB** + Gmail first **100** msgs → **20** threads (**3GB** cap) |</w:t>
         <w:br/>
         <w:t>| `--as-is` | off | Walk-order Drive copy until `--cap-gb` (default 40GB); no quality scan/Gmail |</w:t>
         <w:br/>
@@ -937,7 +937,7 @@
         <w:t>python tools/build_quality_sample_local.py --root ~/Downloads/company-dump</w:t>
         <w:br/>
         <w:br/>
-        <w:t># One account — Drive 5GB + full Gmail</w:t>
+        <w:t># One account — Drive 5GB + Gmail (100 msgs → 20 threads, 3GB)</w:t>
         <w:br/>
         <w:t>python tools/build_quality_sample.py --full-account</w:t>
         <w:br/>

</xml_diff>

<commit_message>
Refresh AI Labs setup guide for full-account Drive then Gmail sample.
Co-authored-by: Cursor <cursoragent@cursor.com>
</commit_message>
<xml_diff>
--- a/CLIENT_SETUP_AI_LABS_SAMPLES.docx
+++ b/CLIENT_SETUP_AI_LABS_SAMPLES.docx
@@ -389,7 +389,7 @@
         <w:t>**Entire account / full-account sample (Drive 5GB + Gmail sample):**</w:t>
         <w:br/>
         <w:br/>
-        <w:t>Creates `AI Labs Sample Set (date)` in admin My Drive (DWD), shares with the selected user, copies Drive as-is until **5GB**, then Gmail: first **100** messages → up to **20** threads (discovery order), **3GB** cap.</w:t>
+        <w:t>Creates `AI Labs Sample Set (date)` in admin My Drive (DWD), shares with the selected user, copies Drive as-is until **5GB** (walk + transfer finish first), then Gmail: first **100** messages → up to **20** threads (discovery order), **3GB** cap. Destination Gmail insert needs the operator's `gmail.insert` OAuth (same as Part 8).</w:t>
         <w:br/>
         <w:br/>
         <w:t>```</w:t>
@@ -506,7 +506,7 @@
         <w:t>**Run — one account, Drive 5GB + Gmail sample (no quality scan)**</w:t>
         <w:br/>
         <w:br/>
-        <w:t>Uses **Domain-Wide Delegation**. Creates `AI Labs Sample Set (date)` in the **admin** My Drive (shared with the selected user), copies Drive **as-is until 5GB**, then Gmail sample: first **100** messages → up to **20** threads, **3GB** cap.</w:t>
+        <w:t>Uses **Domain-Wide Delegation**. Creates `AI Labs Sample Set (date)` in the **admin** My Drive (shared with the selected user), copies Drive **as-is until 5GB** and waits until that transfer finishes, then Gmail sample: first **100** messages → up to **20** threads, **3GB** cap. Gmail insert uses the destination account's OAuth (`gmail.insert` — Part 8).</w:t>
         <w:br/>
         <w:br/>
         <w:t>```</w:t>

</xml_diff>

<commit_message>
Document exact Domain-Wide Delegation setup steps and scopes.
Co-authored-by: Cursor <cursoragent@cursor.com>
</commit_message>
<xml_diff>
--- a/CLIENT_SETUP_AI_LABS_SAMPLES.docx
+++ b/CLIENT_SETUP_AI_LABS_SAMPLES.docx
@@ -443,24 +443,121 @@
         <w:t>### 5B — Whole Workspace (Service Account + Domain-Wide Delegation)</w:t>
         <w:br/>
         <w:br/>
-        <w:t>**Operator — create Service Account**</w:t>
-        <w:br/>
-        <w:br/>
-        <w:t>1. [Google Cloud Console](https://console.cloud.google.com/) → project (can reuse Part 3) → **IAM &amp; Admin** → **Service Accounts** → **Create Service Account** → name → **Done**.</w:t>
-        <w:br/>
-        <w:t>2. Service account → **Keys** → **Add Key** → **Create new key** → **JSON** → save the file.</w:t>
-        <w:br/>
-        <w:t>3. **Details** → **Advanced settings** → copy **Client ID** → enable Domain-wide delegation if shown.</w:t>
-        <w:br/>
-        <w:t>4. **APIs &amp; Services** → **Library** → enable **Google Drive API**, **Admin SDK API**, **Gmail API**.</w:t>
-        <w:br/>
-        <w:t>5. Send only the **Client ID** to the Workspace super-admin (not the JSON key).</w:t>
-        <w:br/>
-        <w:br/>
-        <w:t>**Workspace super-admin — authorize**</w:t>
-        <w:br/>
-        <w:br/>
-        <w:t>6. [admin.google.com](https://admin.google.com) → **Security** → **Access and data control** → **API controls** → **Manage Domain Wide Delegation** → **Add new** → paste Client ID + scopes:</w:t>
+        <w:t>Use this for `--full-account`, `--as-is`, or a whole-Workspace quality sample. Two people are involved:</w:t>
+        <w:br/>
+        <w:br/>
+        <w:t>- **Operator** — creates the Google Cloud service account + JSON key (Parts A–C below).</w:t>
+        <w:br/>
+        <w:t>- **Workspace super-admin** — authorizes Domain-Wide Delegation in Admin Console (Part D).</w:t>
+        <w:br/>
+        <w:br/>
+        <w:t>---</w:t>
+        <w:br/>
+        <w:br/>
+        <w:t>#### A. Operator — create the Google Cloud project + enable APIs</w:t>
+        <w:br/>
+        <w:br/>
+        <w:t>1. Open **https://console.cloud.google.com/** and sign in.</w:t>
+        <w:br/>
+        <w:t>2. Top bar → project dropdown → pick the project from Part 3, or **New Project** → name it → **Create** → select it.</w:t>
+        <w:br/>
+        <w:t>3. Left menu → **APIs &amp; Services** → **Library**.</w:t>
+        <w:br/>
+        <w:t>4. Search and **Enable** each of these (if not already enabled):</w:t>
+        <w:br/>
+        <w:t xml:space="preserve">   - **Google Drive API**</w:t>
+        <w:br/>
+        <w:t xml:space="preserve">   - **Admin SDK API**</w:t>
+        <w:br/>
+        <w:t xml:space="preserve">   - **Gmail API**</w:t>
+        <w:br/>
+        <w:br/>
+        <w:t>---</w:t>
+        <w:br/>
+        <w:br/>
+        <w:t>#### B. Operator — create the Service Account + JSON key</w:t>
+        <w:br/>
+        <w:br/>
+        <w:t>1. Left menu → **IAM &amp; Admin** → **Service Accounts**.</w:t>
+        <w:br/>
+        <w:t>2. Click **+ Create Service Account**.</w:t>
+        <w:br/>
+        <w:t>3. **Service account name** — e.g. `ai-labs-samples` → **Create and Continue**.</w:t>
+        <w:br/>
+        <w:t>4. **Grant this service account access to project** — skip (click **Continue**). Optional roles are not required for DWD.</w:t>
+        <w:br/>
+        <w:t>5. **Grant users access** — skip → **Done**.</w:t>
+        <w:br/>
+        <w:t>6. In the service accounts list, click the new account (email looks like `ai-labs-samples@PROJECT_ID.iam.gserviceaccount.com`).</w:t>
+        <w:br/>
+        <w:t>7. Open the **Details** tab.</w:t>
+        <w:br/>
+        <w:t>8. Expand **Advanced settings** (or **Show domain-wide delegation**):</w:t>
+        <w:br/>
+        <w:t xml:space="preserve">   - Check **Enable Google Workspace Domain-wide Delegation** if a checkbox is shown.</w:t>
+        <w:br/>
+        <w:t xml:space="preserve">   - **Product name for the consent screen** — any name (e.g. `AI Labs Samples`) if asked → **Save**.</w:t>
+        <w:br/>
+        <w:t>9. Still on **Details**, copy the **Unique ID** / **Client ID** (long **numeric** string, e.g. `123456789012345678901`).</w:t>
+        <w:br/>
+        <w:t xml:space="preserve">   - This is the ID the super-admin pastes into Admin Console — **not** the service account email.</w:t>
+        <w:br/>
+        <w:t>10. Open the **Keys** tab → **Add Key** → **Create new key** → type **JSON** → **Create**.</w:t>
+        <w:br/>
+        <w:t>11. Save the downloaded file somewhere safe, e.g. `~/Downloads/service_account.json`.</w:t>
+        <w:br/>
+        <w:t>12. Send the Workspace super-admin **only**:</w:t>
+        <w:br/>
+        <w:t xml:space="preserve">    - the **Client ID** (numeric), and</w:t>
+        <w:br/>
+        <w:t xml:space="preserve">    - the **exact scopes list** from Part D below.  </w:t>
+        <w:br/>
+        <w:t xml:space="preserve">    Do **not** send the JSON key unless they are also the operator.</w:t>
+        <w:br/>
+        <w:br/>
+        <w:t>---</w:t>
+        <w:br/>
+        <w:br/>
+        <w:t>#### C. Operator — (optional) confirm Client ID location</w:t>
+        <w:br/>
+        <w:br/>
+        <w:t>If you lost the Client ID:</w:t>
+        <w:br/>
+        <w:br/>
+        <w:t>1. **IAM &amp; Admin** → **Service Accounts** → click the account.</w:t>
+        <w:br/>
+        <w:t>2. **Details** → **Unique ID** / **OAuth 2 Client ID** (digits only).</w:t>
+        <w:br/>
+        <w:br/>
+        <w:t>Or: **APIs &amp; Services** → **Credentials** → under **OAuth 2.0 Client IDs**, find the service account’s client → copy **Client ID**.</w:t>
+        <w:br/>
+        <w:br/>
+        <w:t>---</w:t>
+        <w:br/>
+        <w:br/>
+        <w:t>#### D. Workspace super-admin — authorize Domain-Wide Delegation</w:t>
+        <w:br/>
+        <w:br/>
+        <w:t>Must be signed in as a **super admin** of the Google Workspace domain.</w:t>
+        <w:br/>
+        <w:br/>
+        <w:t>1. Open **https://admin.google.com/**.</w:t>
+        <w:br/>
+        <w:t>2. Left menu → **Security**.</w:t>
+        <w:br/>
+        <w:t xml:space="preserve">   - If you don’t see it: click **Show more** / **Directory** areas until **Security** appears (super-admin only).</w:t>
+        <w:br/>
+        <w:t>3. **Security** → **Access and data control** → **API controls**.</w:t>
+        <w:br/>
+        <w:t xml:space="preserve">   - Older UI path: **Security** → **API controls**.</w:t>
+        <w:br/>
+        <w:t>4. Under **Domain wide delegation**, click **Manage Domain Wide Delegation** (or **Manage domain-wide delegation**).</w:t>
+        <w:br/>
+        <w:t>5. Click **Add new**.</w:t>
+        <w:br/>
+        <w:t>6. **Client ID** — paste the **numeric** Client ID from the operator (Part B step 9).</w:t>
+        <w:br/>
+        <w:t>7. **OAuth scopes** — paste **exactly** this comma-separated list (one line, no spaces after commas is fine; spaces after commas also OK):</w:t>
         <w:br/>
         <w:br/>
         <w:t>```</w:t>
@@ -470,13 +567,34 @@
         <w:t>```</w:t>
         <w:br/>
         <w:br/>
-        <w:t>→ **Authorise**. Wait 5–10 min if first run fails with `unauthorized_client`.</w:t>
-        <w:br/>
-        <w:br/>
-        <w:t>Use the full `drive` scope (not only `drive.readonly`) so `--full-account` / `--as-is` can create the sample folder in the **super-admin** My Drive and copy via Domain-Wide Delegation with **no personal OAuth browser login**.</w:t>
-        <w:br/>
-        <w:br/>
-        <w:t>**Operator — save credentials**</w:t>
+        <w:t>Same scopes, one per line for checking:</w:t>
+        <w:br/>
+        <w:br/>
+        <w:t>| Scope | Why |</w:t>
+        <w:br/>
+        <w:t>| --- | --- |</w:t>
+        <w:br/>
+        <w:t>| `https://www.googleapis.com/auth/drive` | Create sample folder in **admin** My Drive, share it, and copy files as the selected user. **Must be full `drive`, not `drive.readonly`.** |</w:t>
+        <w:br/>
+        <w:t>| `https://www.googleapis.com/auth/admin.directory.user.readonly` | List Workspace users (whole-domain scan). Not required if you always pass `--users EMAIL`. |</w:t>
+        <w:br/>
+        <w:t>| `https://www.googleapis.com/auth/gmail.readonly` | Read the selected user’s mailbox for Gmail sample (`--full-account`). |</w:t>
+        <w:br/>
+        <w:br/>
+        <w:t>8. Click **Authorise** (or **Authorize**).</w:t>
+        <w:br/>
+        <w:t>9. Confirm the new row appears in the Domain-wide delegation list with that Client ID and those scopes.</w:t>
+        <w:br/>
+        <w:t>10. Wait **5–10 minutes** before the first run. If you see `RefreshError: unauthorized_client` or `unauthorized_client`, wait and retry — scopes often need a few minutes to propagate. Double-check you used **full** `drive` (not `drive.readonly`) and the correct numeric Client ID.</w:t>
+        <w:br/>
+        <w:br/>
+        <w:t>**Editing scopes later:** open the same Client ID row → **Edit** → replace the scopes string → **Authorise** again → wait 5–10 min.</w:t>
+        <w:br/>
+        <w:br/>
+        <w:t>---</w:t>
+        <w:br/>
+        <w:br/>
+        <w:t>#### E. Operator — save Service Account path (optional helper)</w:t>
         <w:br/>
         <w:br/>
         <w:t>```</w:t>
@@ -486,7 +604,19 @@
         <w:t>```</w:t>
         <w:br/>
         <w:br/>
-        <w:t>When asked `Set up Service Account for full workspace scan? (y/n)` → `y` → path to JSON key → Workspace super-admin email (e.g. `admin@yourdomain.com`).</w:t>
+        <w:t>When asked `Set up Service Account for full workspace scan? (y/n)` → `y` → path to JSON key → Workspace **super-admin** email (e.g. `admin@yourdomain.com`).</w:t>
+        <w:br/>
+        <w:br/>
+        <w:t>You can also pass paths on every command with `--service-account` and `--admin-email` (examples below) without `setup.py`.</w:t>
+        <w:br/>
+        <w:br/>
+        <w:t>**`--admin-email` must be a real super-admin (or admin) user in the domain** — the script impersonates that user to create the sample folder in **their** My Drive, then shares it with `--users`.</w:t>
+        <w:br/>
+        <w:br/>
+        <w:t>---</w:t>
+        <w:br/>
+        <w:br/>
+        <w:t>#### F. Run commands (after DWD is authorized)</w:t>
         <w:br/>
         <w:br/>
         <w:t>**Run — whole Workspace (scan + transfer)**</w:t>
@@ -916,6 +1046,12 @@
         <w:t>| Gmail insert permission error | Add `gmail.insert` scope (Part 8 setup) |</w:t>
         <w:br/>
         <w:t>| Unexpected browser login in Part 5 | Destination OAuth consent (default transfer). Use `--scan-only` to skip |</w:t>
+        <w:br/>
+        <w:t>| `unauthorized_client` / `RefreshError` with `--service-account` | Super-admin must authorize DWD (Part 5B §D). Use **numeric Client ID**, full `drive` scope (not `drive.readonly`), wait 5–10 min after Authorize |</w:t>
+        <w:br/>
+        <w:t>| DWD: wrong Client ID | Paste the service account **Unique ID** (digits), not the `...@....iam.gserviceaccount.com` email |</w:t>
+        <w:br/>
+        <w:t>| DWD: folder create / copy denied | Scopes must include `https://www.googleapis.com/auth/drive` (full). Edit the DWD row and re-authorize |</w:t>
         <w:br/>
         <w:t>| Part 5 didn't re-scan | Manifest already exists — add `--rescan` |</w:t>
         <w:br/>

</xml_diff>